<commit_message>
Commit message from COMMIT_MESSAGE_SIMPLE.txt
</commit_message>
<xml_diff>
--- a/25301777_Jaywin_WEBB262_SS2.docx
+++ b/25301777_Jaywin_WEBB262_SS2.docx
@@ -1090,6 +1090,59 @@
           </wp:inline>
         </w:drawing>
       </w:r>
+    </w:p>
+    <w:p>
+      <w:pPr>
+        <w:rPr>
+          <w:rFonts w:ascii="Calibri" w:hAnsi="Calibri" w:cs="Calibri"/>
+          <w:sz w:val="20"/>
+          <w:szCs w:val="20"/>
+        </w:rPr>
+      </w:pPr>
+      <w:proofErr w:type="spellStart"/>
+      <w:r>
+        <w:rPr>
+          <w:rFonts w:ascii="Calibri" w:hAnsi="Calibri" w:cs="Calibri"/>
+          <w:b/>
+          <w:bCs/>
+          <w:sz w:val="20"/>
+          <w:szCs w:val="20"/>
+        </w:rPr>
+        <w:t>Github</w:t>
+      </w:r>
+      <w:proofErr w:type="spellEnd"/>
+      <w:r>
+        <w:rPr>
+          <w:rFonts w:ascii="Calibri" w:hAnsi="Calibri" w:cs="Calibri"/>
+          <w:b/>
+          <w:bCs/>
+          <w:sz w:val="20"/>
+          <w:szCs w:val="20"/>
+        </w:rPr>
+        <w:t xml:space="preserve"> link: </w:t>
+      </w:r>
+      <w:hyperlink r:id="rId22" w:history="1">
+        <w:r>
+          <w:rPr>
+            <w:rStyle w:val="Hyperlink"/>
+            <w:rFonts w:ascii="Calibri" w:hAnsi="Calibri" w:cs="Calibri"/>
+            <w:b/>
+            <w:bCs/>
+            <w:sz w:val="20"/>
+            <w:szCs w:val="20"/>
+          </w:rPr>
+          <w:t>jaywinwaterboer03-dot/SomaShare_WEBB262_SS2: University textbook exchange platform built with Blazor, ASP.NET Core, EF Core and SQL Server.</w:t>
+        </w:r>
+      </w:hyperlink>
+    </w:p>
+    <w:p>
+      <w:pPr>
+        <w:rPr>
+          <w:rFonts w:ascii="Calibri" w:hAnsi="Calibri" w:cs="Calibri"/>
+          <w:sz w:val="20"/>
+          <w:szCs w:val="20"/>
+        </w:rPr>
+      </w:pPr>
     </w:p>
     <w:sectPr>
       <w:pgSz w:w="11906" w:h="16838"/>
@@ -1704,7 +1757,6 @@
   <w:style w:type="character" w:default="1" w:styleId="DefaultParagraphFont">
     <w:name w:val="Default Paragraph Font"/>
     <w:uiPriority w:val="1"/>
-    <w:semiHidden/>
     <w:unhideWhenUsed/>
   </w:style>
   <w:style w:type="table" w:default="1" w:styleId="TableNormal">

</xml_diff>